<commit_message>
Include changes to classwork/rubric
</commit_message>
<xml_diff>
--- a/CourseMaterial/04_learning_machines/08_teaching_unit/teaching_unit_rubric.docx
+++ b/CourseMaterial/04_learning_machines/08_teaching_unit/teaching_unit_rubric.docx
@@ -185,42 +185,74 @@
                 <w:sz w:val="20"/>
                 <w:szCs w:val="20"/>
               </w:rPr>
-              <w:t>Essential questions and objectives are thoughtful, realistic, and scaled</w:t>
-            </w:r>
-          </w:p>
-          <w:p>
-            <w:pPr>
-              <w:rPr>
-                <w:rFonts w:ascii="Garamond" w:hAnsi="Garamond"/>
-                <w:sz w:val="20"/>
-                <w:szCs w:val="20"/>
-              </w:rPr>
-            </w:pPr>
-          </w:p>
-          <w:p>
-            <w:pPr>
-              <w:rPr>
-                <w:rFonts w:ascii="Garamond" w:hAnsi="Garamond"/>
-                <w:sz w:val="20"/>
-                <w:szCs w:val="20"/>
-              </w:rPr>
-            </w:pPr>
-          </w:p>
-          <w:p>
-            <w:pPr>
-              <w:rPr>
-                <w:rFonts w:ascii="Garamond" w:hAnsi="Garamond"/>
-                <w:sz w:val="20"/>
-                <w:szCs w:val="20"/>
-              </w:rPr>
-            </w:pPr>
-            <w:r>
-              <w:rPr>
-                <w:rFonts w:ascii="Garamond" w:hAnsi="Garamond"/>
-                <w:sz w:val="20"/>
-                <w:szCs w:val="20"/>
-              </w:rPr>
-              <w:t>10 points</w:t>
+              <w:t xml:space="preserve">Essential </w:t>
+            </w:r>
+            <w:r>
+              <w:rPr>
+                <w:rFonts w:ascii="Garamond" w:hAnsi="Garamond"/>
+                <w:sz w:val="20"/>
+                <w:szCs w:val="20"/>
+              </w:rPr>
+              <w:t>Q</w:t>
+            </w:r>
+            <w:r>
+              <w:rPr>
+                <w:rFonts w:ascii="Garamond" w:hAnsi="Garamond"/>
+                <w:sz w:val="20"/>
+                <w:szCs w:val="20"/>
+              </w:rPr>
+              <w:t>uestions and objectives are thoughtful, realistic, and scaled</w:t>
+            </w:r>
+          </w:p>
+          <w:p>
+            <w:pPr>
+              <w:rPr>
+                <w:rFonts w:ascii="Garamond" w:hAnsi="Garamond"/>
+                <w:sz w:val="20"/>
+                <w:szCs w:val="20"/>
+              </w:rPr>
+            </w:pPr>
+          </w:p>
+          <w:p>
+            <w:pPr>
+              <w:rPr>
+                <w:rFonts w:ascii="Garamond" w:hAnsi="Garamond"/>
+                <w:sz w:val="20"/>
+                <w:szCs w:val="20"/>
+              </w:rPr>
+            </w:pPr>
+          </w:p>
+          <w:p>
+            <w:pPr>
+              <w:rPr>
+                <w:rFonts w:ascii="Garamond" w:hAnsi="Garamond"/>
+                <w:sz w:val="20"/>
+                <w:szCs w:val="20"/>
+              </w:rPr>
+            </w:pPr>
+            <w:r>
+              <w:rPr>
+                <w:rFonts w:ascii="Garamond" w:hAnsi="Garamond"/>
+                <w:sz w:val="20"/>
+                <w:szCs w:val="20"/>
+              </w:rPr>
+              <w:t>1</w:t>
+            </w:r>
+            <w:r>
+              <w:rPr>
+                <w:rFonts w:ascii="Garamond" w:hAnsi="Garamond"/>
+                <w:sz w:val="20"/>
+                <w:szCs w:val="20"/>
+              </w:rPr>
+              <w:t>5</w:t>
+            </w:r>
+            <w:r>
+              <w:rPr>
+                <w:rFonts w:ascii="Garamond" w:hAnsi="Garamond"/>
+                <w:sz w:val="20"/>
+                <w:szCs w:val="20"/>
+              </w:rPr>
+              <w:t xml:space="preserve"> points</w:t>
             </w:r>
           </w:p>
         </w:tc>
@@ -428,7 +460,15 @@
                 <w:sz w:val="20"/>
                 <w:szCs w:val="20"/>
               </w:rPr>
-              <w:t>10 points</w:t>
+              <w:t>20</w:t>
+            </w:r>
+            <w:r>
+              <w:rPr>
+                <w:rFonts w:ascii="Garamond" w:hAnsi="Garamond"/>
+                <w:sz w:val="20"/>
+                <w:szCs w:val="20"/>
+              </w:rPr>
+              <w:t xml:space="preserve"> points</w:t>
             </w:r>
           </w:p>
         </w:tc>
@@ -501,7 +541,208 @@
                 <w:sz w:val="20"/>
                 <w:szCs w:val="20"/>
               </w:rPr>
-              <w:t xml:space="preserve">- Lessons use provided time well </w:t>
+              <w:t>- Lessons use provided time well</w:t>
+            </w:r>
+          </w:p>
+        </w:tc>
+        <w:tc>
+          <w:tcPr>
+            <w:tcW w:w="1432" w:type="dxa"/>
+          </w:tcPr>
+          <w:p>
+            <w:pPr>
+              <w:rPr>
+                <w:rFonts w:ascii="Garamond" w:hAnsi="Garamond"/>
+                <w:sz w:val="20"/>
+                <w:szCs w:val="20"/>
+              </w:rPr>
+            </w:pPr>
+            <w:r>
+              <w:rPr>
+                <w:rFonts w:ascii="Garamond" w:hAnsi="Garamond"/>
+                <w:sz w:val="20"/>
+                <w:szCs w:val="20"/>
+              </w:rPr>
+              <w:t>Regular Examples</w:t>
+            </w:r>
+          </w:p>
+        </w:tc>
+        <w:tc>
+          <w:tcPr>
+            <w:tcW w:w="1344" w:type="dxa"/>
+          </w:tcPr>
+          <w:p>
+            <w:pPr>
+              <w:rPr>
+                <w:rFonts w:ascii="Garamond" w:hAnsi="Garamond"/>
+                <w:sz w:val="20"/>
+                <w:szCs w:val="20"/>
+              </w:rPr>
+            </w:pPr>
+            <w:r>
+              <w:rPr>
+                <w:rFonts w:ascii="Garamond" w:hAnsi="Garamond"/>
+                <w:sz w:val="20"/>
+                <w:szCs w:val="20"/>
+              </w:rPr>
+              <w:t>Multiple Examples</w:t>
+            </w:r>
+          </w:p>
+        </w:tc>
+        <w:tc>
+          <w:tcPr>
+            <w:tcW w:w="1315" w:type="dxa"/>
+          </w:tcPr>
+          <w:p>
+            <w:pPr>
+              <w:rPr>
+                <w:rFonts w:ascii="Garamond" w:hAnsi="Garamond"/>
+                <w:sz w:val="20"/>
+                <w:szCs w:val="20"/>
+              </w:rPr>
+            </w:pPr>
+            <w:r>
+              <w:rPr>
+                <w:rFonts w:ascii="Garamond" w:hAnsi="Garamond"/>
+                <w:sz w:val="20"/>
+                <w:szCs w:val="20"/>
+              </w:rPr>
+              <w:t>Infrequent examples</w:t>
+            </w:r>
+          </w:p>
+        </w:tc>
+      </w:tr>
+      <w:tr>
+        <w:trPr>
+          <w:trHeight w:val="1094"/>
+        </w:trPr>
+        <w:tc>
+          <w:tcPr>
+            <w:tcW w:w="2220" w:type="dxa"/>
+          </w:tcPr>
+          <w:p>
+            <w:pPr>
+              <w:rPr>
+                <w:rFonts w:ascii="Garamond" w:hAnsi="Garamond"/>
+                <w:sz w:val="20"/>
+                <w:szCs w:val="20"/>
+              </w:rPr>
+            </w:pPr>
+            <w:r>
+              <w:rPr>
+                <w:rFonts w:ascii="Garamond" w:hAnsi="Garamond"/>
+                <w:sz w:val="20"/>
+                <w:szCs w:val="20"/>
+              </w:rPr>
+              <w:t>Lesson is engaging</w:t>
+            </w:r>
+          </w:p>
+          <w:p>
+            <w:pPr>
+              <w:rPr>
+                <w:rFonts w:ascii="Garamond" w:hAnsi="Garamond"/>
+                <w:sz w:val="20"/>
+                <w:szCs w:val="20"/>
+              </w:rPr>
+            </w:pPr>
+          </w:p>
+          <w:p>
+            <w:pPr>
+              <w:rPr>
+                <w:rFonts w:ascii="Garamond" w:hAnsi="Garamond"/>
+                <w:sz w:val="20"/>
+                <w:szCs w:val="20"/>
+              </w:rPr>
+            </w:pPr>
+          </w:p>
+          <w:p>
+            <w:pPr>
+              <w:rPr>
+                <w:rFonts w:ascii="Garamond" w:hAnsi="Garamond"/>
+                <w:sz w:val="20"/>
+                <w:szCs w:val="20"/>
+              </w:rPr>
+            </w:pPr>
+          </w:p>
+          <w:p>
+            <w:pPr>
+              <w:rPr>
+                <w:rFonts w:ascii="Garamond" w:hAnsi="Garamond"/>
+                <w:sz w:val="20"/>
+                <w:szCs w:val="20"/>
+              </w:rPr>
+            </w:pPr>
+            <w:r>
+              <w:rPr>
+                <w:rFonts w:ascii="Garamond" w:hAnsi="Garamond"/>
+                <w:sz w:val="20"/>
+                <w:szCs w:val="20"/>
+              </w:rPr>
+              <w:t>15</w:t>
+            </w:r>
+            <w:r>
+              <w:rPr>
+                <w:rFonts w:ascii="Garamond" w:hAnsi="Garamond"/>
+                <w:sz w:val="20"/>
+                <w:szCs w:val="20"/>
+              </w:rPr>
+              <w:t xml:space="preserve"> points</w:t>
+            </w:r>
+          </w:p>
+        </w:tc>
+        <w:tc>
+          <w:tcPr>
+            <w:tcW w:w="3764" w:type="dxa"/>
+          </w:tcPr>
+          <w:p>
+            <w:pPr>
+              <w:rPr>
+                <w:rFonts w:ascii="Garamond" w:hAnsi="Garamond"/>
+                <w:sz w:val="20"/>
+                <w:szCs w:val="20"/>
+              </w:rPr>
+            </w:pPr>
+            <w:r>
+              <w:rPr>
+                <w:rFonts w:ascii="Garamond" w:hAnsi="Garamond"/>
+                <w:sz w:val="20"/>
+                <w:szCs w:val="20"/>
+              </w:rPr>
+              <w:t>- Lesson reframes/explains a real-world concept</w:t>
+            </w:r>
+          </w:p>
+          <w:p>
+            <w:pPr>
+              <w:rPr>
+                <w:rFonts w:ascii="Garamond" w:hAnsi="Garamond"/>
+                <w:sz w:val="20"/>
+                <w:szCs w:val="20"/>
+              </w:rPr>
+            </w:pPr>
+            <w:r>
+              <w:rPr>
+                <w:rFonts w:ascii="Garamond" w:hAnsi="Garamond"/>
+                <w:sz w:val="20"/>
+                <w:szCs w:val="20"/>
+              </w:rPr>
+              <w:t>- Lesson requires some sort of problem solving/logic</w:t>
+            </w:r>
+          </w:p>
+          <w:p>
+            <w:pPr>
+              <w:rPr>
+                <w:rFonts w:ascii="Garamond" w:hAnsi="Garamond"/>
+                <w:sz w:val="20"/>
+                <w:szCs w:val="20"/>
+              </w:rPr>
+            </w:pPr>
+            <w:r>
+              <w:rPr>
+                <w:rFonts w:ascii="Garamond" w:hAnsi="Garamond"/>
+                <w:sz w:val="20"/>
+                <w:szCs w:val="20"/>
+              </w:rPr>
+              <w:t>- Lesson allows students to show creativity</w:t>
             </w:r>
           </w:p>
         </w:tc>
@@ -656,7 +897,15 @@
                 <w:sz w:val="20"/>
                 <w:szCs w:val="20"/>
               </w:rPr>
-              <w:t>20 points</w:t>
+              <w:t>25</w:t>
+            </w:r>
+            <w:r>
+              <w:rPr>
+                <w:rFonts w:ascii="Garamond" w:hAnsi="Garamond"/>
+                <w:sz w:val="20"/>
+                <w:szCs w:val="20"/>
+              </w:rPr>
+              <w:t xml:space="preserve"> points</w:t>
             </w:r>
           </w:p>
         </w:tc>
@@ -769,7 +1018,31 @@
                 <w:sz w:val="20"/>
                 <w:szCs w:val="20"/>
               </w:rPr>
-              <w:t>- Rubrics (if applicable) are clear, achievable, and eliminate ambiguity</w:t>
+              <w:t xml:space="preserve">- </w:t>
+            </w:r>
+            <w:r>
+              <w:rPr>
+                <w:rFonts w:ascii="Garamond" w:hAnsi="Garamond"/>
+                <w:sz w:val="20"/>
+                <w:szCs w:val="20"/>
+              </w:rPr>
+              <w:t>Assessments</w:t>
+            </w:r>
+            <w:r>
+              <w:rPr>
+                <w:rFonts w:ascii="Garamond" w:hAnsi="Garamond"/>
+                <w:sz w:val="20"/>
+                <w:szCs w:val="20"/>
+              </w:rPr>
+              <w:t xml:space="preserve"> (if applicable) are clear, achievable, and </w:t>
+            </w:r>
+            <w:r>
+              <w:rPr>
+                <w:rFonts w:ascii="Garamond" w:hAnsi="Garamond"/>
+                <w:sz w:val="20"/>
+                <w:szCs w:val="20"/>
+              </w:rPr>
+              <w:t>measure learning</w:t>
             </w:r>
           </w:p>
         </w:tc>
@@ -1311,423 +1584,6 @@
       </w:tr>
       <w:tr>
         <w:trPr>
-          <w:trHeight w:val="1085"/>
-        </w:trPr>
-        <w:tc>
-          <w:tcPr>
-            <w:tcW w:w="2220" w:type="dxa"/>
-          </w:tcPr>
-          <w:p>
-            <w:pPr>
-              <w:rPr>
-                <w:rFonts w:ascii="Garamond" w:hAnsi="Garamond"/>
-                <w:sz w:val="20"/>
-                <w:szCs w:val="20"/>
-              </w:rPr>
-            </w:pPr>
-            <w:r>
-              <w:rPr>
-                <w:rFonts w:ascii="Garamond" w:hAnsi="Garamond"/>
-                <w:sz w:val="20"/>
-                <w:szCs w:val="20"/>
-              </w:rPr>
-              <w:t>Lesson is engaging</w:t>
-            </w:r>
-          </w:p>
-          <w:p>
-            <w:pPr>
-              <w:rPr>
-                <w:rFonts w:ascii="Garamond" w:hAnsi="Garamond"/>
-                <w:sz w:val="20"/>
-                <w:szCs w:val="20"/>
-              </w:rPr>
-            </w:pPr>
-          </w:p>
-          <w:p>
-            <w:pPr>
-              <w:rPr>
-                <w:rFonts w:ascii="Garamond" w:hAnsi="Garamond"/>
-                <w:sz w:val="20"/>
-                <w:szCs w:val="20"/>
-              </w:rPr>
-            </w:pPr>
-          </w:p>
-          <w:p>
-            <w:pPr>
-              <w:rPr>
-                <w:rFonts w:ascii="Garamond" w:hAnsi="Garamond"/>
-                <w:sz w:val="20"/>
-                <w:szCs w:val="20"/>
-              </w:rPr>
-            </w:pPr>
-          </w:p>
-          <w:p>
-            <w:pPr>
-              <w:rPr>
-                <w:rFonts w:ascii="Garamond" w:hAnsi="Garamond"/>
-                <w:sz w:val="20"/>
-                <w:szCs w:val="20"/>
-              </w:rPr>
-            </w:pPr>
-            <w:r>
-              <w:rPr>
-                <w:rFonts w:ascii="Garamond" w:hAnsi="Garamond"/>
-                <w:sz w:val="20"/>
-                <w:szCs w:val="20"/>
-              </w:rPr>
-              <w:t>15 points</w:t>
-            </w:r>
-          </w:p>
-        </w:tc>
-        <w:tc>
-          <w:tcPr>
-            <w:tcW w:w="3764" w:type="dxa"/>
-          </w:tcPr>
-          <w:p>
-            <w:pPr>
-              <w:rPr>
-                <w:rFonts w:ascii="Garamond" w:hAnsi="Garamond"/>
-                <w:sz w:val="20"/>
-                <w:szCs w:val="20"/>
-              </w:rPr>
-            </w:pPr>
-            <w:r>
-              <w:rPr>
-                <w:rFonts w:ascii="Garamond" w:hAnsi="Garamond"/>
-                <w:sz w:val="20"/>
-                <w:szCs w:val="20"/>
-              </w:rPr>
-              <w:t>- Lesson reframes/explains a real-world concept</w:t>
-            </w:r>
-          </w:p>
-          <w:p>
-            <w:pPr>
-              <w:rPr>
-                <w:rFonts w:ascii="Garamond" w:hAnsi="Garamond"/>
-                <w:sz w:val="20"/>
-                <w:szCs w:val="20"/>
-              </w:rPr>
-            </w:pPr>
-            <w:r>
-              <w:rPr>
-                <w:rFonts w:ascii="Garamond" w:hAnsi="Garamond"/>
-                <w:sz w:val="20"/>
-                <w:szCs w:val="20"/>
-              </w:rPr>
-              <w:t>- Lesson requires some sort of problem solving/logic</w:t>
-            </w:r>
-          </w:p>
-          <w:p>
-            <w:pPr>
-              <w:rPr>
-                <w:rFonts w:ascii="Garamond" w:hAnsi="Garamond"/>
-                <w:sz w:val="20"/>
-                <w:szCs w:val="20"/>
-              </w:rPr>
-            </w:pPr>
-            <w:r>
-              <w:rPr>
-                <w:rFonts w:ascii="Garamond" w:hAnsi="Garamond"/>
-                <w:sz w:val="20"/>
-                <w:szCs w:val="20"/>
-              </w:rPr>
-              <w:t>- Lesson allows students to show creativity</w:t>
-            </w:r>
-          </w:p>
-        </w:tc>
-        <w:tc>
-          <w:tcPr>
-            <w:tcW w:w="1432" w:type="dxa"/>
-          </w:tcPr>
-          <w:p>
-            <w:pPr>
-              <w:rPr>
-                <w:rFonts w:ascii="Garamond" w:hAnsi="Garamond"/>
-                <w:sz w:val="20"/>
-                <w:szCs w:val="20"/>
-              </w:rPr>
-            </w:pPr>
-            <w:r>
-              <w:rPr>
-                <w:rFonts w:ascii="Garamond" w:hAnsi="Garamond"/>
-                <w:sz w:val="20"/>
-                <w:szCs w:val="20"/>
-              </w:rPr>
-              <w:t>Regular Examples</w:t>
-            </w:r>
-          </w:p>
-        </w:tc>
-        <w:tc>
-          <w:tcPr>
-            <w:tcW w:w="1344" w:type="dxa"/>
-          </w:tcPr>
-          <w:p>
-            <w:pPr>
-              <w:rPr>
-                <w:rFonts w:ascii="Garamond" w:hAnsi="Garamond"/>
-                <w:sz w:val="20"/>
-                <w:szCs w:val="20"/>
-              </w:rPr>
-            </w:pPr>
-            <w:r>
-              <w:rPr>
-                <w:rFonts w:ascii="Garamond" w:hAnsi="Garamond"/>
-                <w:sz w:val="20"/>
-                <w:szCs w:val="20"/>
-              </w:rPr>
-              <w:t>Multiple Examples</w:t>
-            </w:r>
-          </w:p>
-        </w:tc>
-        <w:tc>
-          <w:tcPr>
-            <w:tcW w:w="1315" w:type="dxa"/>
-          </w:tcPr>
-          <w:p>
-            <w:pPr>
-              <w:rPr>
-                <w:rFonts w:ascii="Garamond" w:hAnsi="Garamond"/>
-                <w:sz w:val="20"/>
-                <w:szCs w:val="20"/>
-              </w:rPr>
-            </w:pPr>
-            <w:r>
-              <w:rPr>
-                <w:rFonts w:ascii="Garamond" w:hAnsi="Garamond"/>
-                <w:sz w:val="20"/>
-                <w:szCs w:val="20"/>
-              </w:rPr>
-              <w:t>Infrequent examples</w:t>
-            </w:r>
-          </w:p>
-        </w:tc>
-      </w:tr>
-      <w:tr>
-        <w:trPr>
-          <w:trHeight w:val="707"/>
-        </w:trPr>
-        <w:tc>
-          <w:tcPr>
-            <w:tcW w:w="2220" w:type="dxa"/>
-          </w:tcPr>
-          <w:p>
-            <w:pPr>
-              <w:rPr>
-                <w:rFonts w:ascii="Garamond" w:hAnsi="Garamond"/>
-                <w:sz w:val="20"/>
-                <w:szCs w:val="20"/>
-              </w:rPr>
-            </w:pPr>
-            <w:r>
-              <w:rPr>
-                <w:rFonts w:ascii="Garamond" w:hAnsi="Garamond"/>
-                <w:sz w:val="20"/>
-                <w:szCs w:val="20"/>
-              </w:rPr>
-              <w:t>Chat</w:t>
-            </w:r>
-            <w:r>
-              <w:rPr>
-                <w:rFonts w:ascii="Garamond" w:hAnsi="Garamond"/>
-                <w:sz w:val="20"/>
-                <w:szCs w:val="20"/>
-              </w:rPr>
-              <w:t>B</w:t>
-            </w:r>
-            <w:r>
-              <w:rPr>
-                <w:rFonts w:ascii="Garamond" w:hAnsi="Garamond"/>
-                <w:sz w:val="20"/>
-                <w:szCs w:val="20"/>
-              </w:rPr>
-              <w:t>ot queries lead to a higher quality lesson</w:t>
-            </w:r>
-          </w:p>
-          <w:p>
-            <w:pPr>
-              <w:rPr>
-                <w:rFonts w:ascii="Garamond" w:hAnsi="Garamond"/>
-                <w:sz w:val="20"/>
-                <w:szCs w:val="20"/>
-              </w:rPr>
-            </w:pPr>
-          </w:p>
-          <w:p>
-            <w:pPr>
-              <w:rPr>
-                <w:rFonts w:ascii="Garamond" w:hAnsi="Garamond"/>
-                <w:sz w:val="20"/>
-                <w:szCs w:val="20"/>
-              </w:rPr>
-            </w:pPr>
-            <w:r>
-              <w:rPr>
-                <w:rFonts w:ascii="Garamond" w:hAnsi="Garamond"/>
-                <w:sz w:val="20"/>
-                <w:szCs w:val="20"/>
-              </w:rPr>
-              <w:t>15 points</w:t>
-            </w:r>
-          </w:p>
-        </w:tc>
-        <w:tc>
-          <w:tcPr>
-            <w:tcW w:w="3764" w:type="dxa"/>
-          </w:tcPr>
-          <w:p>
-            <w:pPr>
-              <w:rPr>
-                <w:rFonts w:ascii="Garamond" w:hAnsi="Garamond"/>
-                <w:sz w:val="20"/>
-                <w:szCs w:val="20"/>
-              </w:rPr>
-            </w:pPr>
-            <w:r>
-              <w:rPr>
-                <w:rFonts w:ascii="Garamond" w:hAnsi="Garamond"/>
-                <w:sz w:val="20"/>
-                <w:szCs w:val="20"/>
-              </w:rPr>
-              <w:t xml:space="preserve">- </w:t>
-            </w:r>
-            <w:r>
-              <w:rPr>
-                <w:rFonts w:ascii="Garamond" w:hAnsi="Garamond"/>
-                <w:sz w:val="20"/>
-                <w:szCs w:val="20"/>
-              </w:rPr>
-              <w:t>All</w:t>
-            </w:r>
-            <w:r>
-              <w:rPr>
-                <w:rFonts w:ascii="Garamond" w:hAnsi="Garamond"/>
-                <w:sz w:val="20"/>
-                <w:szCs w:val="20"/>
-              </w:rPr>
-              <w:t xml:space="preserve"> </w:t>
-            </w:r>
-            <w:proofErr w:type="spellStart"/>
-            <w:r>
-              <w:rPr>
-                <w:rFonts w:ascii="Garamond" w:hAnsi="Garamond"/>
-                <w:sz w:val="20"/>
-                <w:szCs w:val="20"/>
-              </w:rPr>
-              <w:t>ChatBot</w:t>
-            </w:r>
-            <w:proofErr w:type="spellEnd"/>
-            <w:r>
-              <w:rPr>
-                <w:rFonts w:ascii="Garamond" w:hAnsi="Garamond"/>
-                <w:sz w:val="20"/>
-                <w:szCs w:val="20"/>
-              </w:rPr>
-              <w:t xml:space="preserve"> queries are documented</w:t>
-            </w:r>
-          </w:p>
-          <w:p>
-            <w:pPr>
-              <w:rPr>
-                <w:rFonts w:ascii="Garamond" w:hAnsi="Garamond"/>
-                <w:sz w:val="20"/>
-                <w:szCs w:val="20"/>
-              </w:rPr>
-            </w:pPr>
-            <w:r>
-              <w:rPr>
-                <w:rFonts w:ascii="Garamond" w:hAnsi="Garamond"/>
-                <w:sz w:val="20"/>
-                <w:szCs w:val="20"/>
-              </w:rPr>
-              <w:t xml:space="preserve">- The effects on your lesson/thinking caused by the answers are </w:t>
-            </w:r>
-            <w:r>
-              <w:rPr>
-                <w:rFonts w:ascii="Garamond" w:hAnsi="Garamond"/>
-                <w:sz w:val="20"/>
-                <w:szCs w:val="20"/>
-              </w:rPr>
-              <w:t xml:space="preserve">clearly </w:t>
-            </w:r>
-            <w:r>
-              <w:rPr>
-                <w:rFonts w:ascii="Garamond" w:hAnsi="Garamond"/>
-                <w:sz w:val="20"/>
-                <w:szCs w:val="20"/>
-              </w:rPr>
-              <w:t xml:space="preserve">documented </w:t>
-            </w:r>
-          </w:p>
-        </w:tc>
-        <w:tc>
-          <w:tcPr>
-            <w:tcW w:w="1432" w:type="dxa"/>
-          </w:tcPr>
-          <w:p>
-            <w:pPr>
-              <w:rPr>
-                <w:rFonts w:ascii="Garamond" w:hAnsi="Garamond"/>
-                <w:sz w:val="20"/>
-                <w:szCs w:val="20"/>
-              </w:rPr>
-            </w:pPr>
-            <w:r>
-              <w:rPr>
-                <w:rFonts w:ascii="Garamond" w:hAnsi="Garamond"/>
-                <w:sz w:val="20"/>
-                <w:szCs w:val="20"/>
-              </w:rPr>
-              <w:t>All q/a’s show thought and reaction</w:t>
-            </w:r>
-          </w:p>
-        </w:tc>
-        <w:tc>
-          <w:tcPr>
-            <w:tcW w:w="1344" w:type="dxa"/>
-          </w:tcPr>
-          <w:p>
-            <w:pPr>
-              <w:rPr>
-                <w:rFonts w:ascii="Garamond" w:hAnsi="Garamond"/>
-                <w:sz w:val="20"/>
-                <w:szCs w:val="20"/>
-              </w:rPr>
-            </w:pPr>
-            <w:r>
-              <w:rPr>
-                <w:rFonts w:ascii="Garamond" w:hAnsi="Garamond"/>
-                <w:sz w:val="20"/>
-                <w:szCs w:val="20"/>
-              </w:rPr>
-              <w:t>Most q/a’s show thought and reaction</w:t>
-            </w:r>
-          </w:p>
-        </w:tc>
-        <w:tc>
-          <w:tcPr>
-            <w:tcW w:w="1315" w:type="dxa"/>
-          </w:tcPr>
-          <w:p>
-            <w:pPr>
-              <w:rPr>
-                <w:rFonts w:ascii="Garamond" w:hAnsi="Garamond"/>
-                <w:sz w:val="20"/>
-                <w:szCs w:val="20"/>
-              </w:rPr>
-            </w:pPr>
-            <w:r>
-              <w:rPr>
-                <w:rFonts w:ascii="Garamond" w:hAnsi="Garamond"/>
-                <w:sz w:val="20"/>
-                <w:szCs w:val="20"/>
-              </w:rPr>
-              <w:t>Inconsistent questions and documentation</w:t>
-            </w:r>
-          </w:p>
-        </w:tc>
-      </w:tr>
-      <w:tr>
-        <w:trPr>
           <w:trHeight w:val="770"/>
         </w:trPr>
         <w:tc>
@@ -1774,7 +1630,15 @@
                 <w:sz w:val="20"/>
                 <w:szCs w:val="20"/>
               </w:rPr>
-              <w:t>10 points</w:t>
+              <w:t>5</w:t>
+            </w:r>
+            <w:r>
+              <w:rPr>
+                <w:rFonts w:ascii="Garamond" w:hAnsi="Garamond"/>
+                <w:sz w:val="20"/>
+                <w:szCs w:val="20"/>
+              </w:rPr>
+              <w:t xml:space="preserve"> points</w:t>
             </w:r>
           </w:p>
         </w:tc>

</xml_diff>

<commit_message>
Small nits to rubric. Update lesson plan name to make room
</commit_message>
<xml_diff>
--- a/CourseMaterial/04_learning_machines/08_teaching_unit/teaching_unit_rubric.docx
+++ b/CourseMaterial/04_learning_machines/08_teaching_unit/teaching_unit_rubric.docx
@@ -708,7 +708,15 @@
                 <w:sz w:val="20"/>
                 <w:szCs w:val="20"/>
               </w:rPr>
-              <w:t>- Lesson reframes/explains a real-world concept</w:t>
+              <w:t>- Lesson reframes/explains a</w:t>
+            </w:r>
+            <w:r>
+              <w:rPr>
+                <w:rFonts w:ascii="Garamond" w:hAnsi="Garamond"/>
+                <w:sz w:val="20"/>
+                <w:szCs w:val="20"/>
+              </w:rPr>
+              <w:t>n import CS topic</w:t>
             </w:r>
           </w:p>
           <w:p>
@@ -835,69 +843,103 @@
                 <w:sz w:val="20"/>
                 <w:szCs w:val="20"/>
               </w:rPr>
-              <w:t>Materials are provided and are professional</w:t>
-            </w:r>
-          </w:p>
-          <w:p>
-            <w:pPr>
-              <w:rPr>
-                <w:rFonts w:ascii="Garamond" w:hAnsi="Garamond"/>
-                <w:sz w:val="20"/>
-                <w:szCs w:val="20"/>
-              </w:rPr>
-            </w:pPr>
-          </w:p>
-          <w:p>
-            <w:pPr>
-              <w:rPr>
-                <w:rFonts w:ascii="Garamond" w:hAnsi="Garamond"/>
-                <w:sz w:val="20"/>
-                <w:szCs w:val="20"/>
-              </w:rPr>
-            </w:pPr>
-          </w:p>
-          <w:p>
-            <w:pPr>
-              <w:rPr>
-                <w:rFonts w:ascii="Garamond" w:hAnsi="Garamond"/>
-                <w:sz w:val="20"/>
-                <w:szCs w:val="20"/>
-              </w:rPr>
-            </w:pPr>
-          </w:p>
-          <w:p>
-            <w:pPr>
-              <w:rPr>
-                <w:rFonts w:ascii="Garamond" w:hAnsi="Garamond"/>
-                <w:sz w:val="20"/>
-                <w:szCs w:val="20"/>
-              </w:rPr>
-            </w:pPr>
-          </w:p>
-          <w:p>
-            <w:pPr>
-              <w:rPr>
-                <w:rFonts w:ascii="Garamond" w:hAnsi="Garamond"/>
-                <w:sz w:val="20"/>
-                <w:szCs w:val="20"/>
-              </w:rPr>
-            </w:pPr>
-          </w:p>
-          <w:p>
-            <w:pPr>
-              <w:rPr>
-                <w:rFonts w:ascii="Garamond" w:hAnsi="Garamond"/>
-                <w:sz w:val="20"/>
-                <w:szCs w:val="20"/>
-              </w:rPr>
-            </w:pPr>
-            <w:r>
-              <w:rPr>
-                <w:rFonts w:ascii="Garamond" w:hAnsi="Garamond"/>
-                <w:sz w:val="20"/>
-                <w:szCs w:val="20"/>
-              </w:rPr>
-              <w:t>25</w:t>
+              <w:t>Class m</w:t>
+            </w:r>
+            <w:r>
+              <w:rPr>
+                <w:rFonts w:ascii="Garamond" w:hAnsi="Garamond"/>
+                <w:sz w:val="20"/>
+                <w:szCs w:val="20"/>
+              </w:rPr>
+              <w:t xml:space="preserve">aterials are </w:t>
+            </w:r>
+            <w:r>
+              <w:rPr>
+                <w:rFonts w:ascii="Garamond" w:hAnsi="Garamond"/>
+                <w:sz w:val="20"/>
+                <w:szCs w:val="20"/>
+              </w:rPr>
+              <w:t>professional, realistic, and achievable</w:t>
+            </w:r>
+          </w:p>
+          <w:p>
+            <w:pPr>
+              <w:rPr>
+                <w:rFonts w:ascii="Garamond" w:hAnsi="Garamond"/>
+                <w:sz w:val="20"/>
+                <w:szCs w:val="20"/>
+              </w:rPr>
+            </w:pPr>
+          </w:p>
+          <w:p>
+            <w:pPr>
+              <w:rPr>
+                <w:rFonts w:ascii="Garamond" w:hAnsi="Garamond"/>
+                <w:sz w:val="20"/>
+                <w:szCs w:val="20"/>
+              </w:rPr>
+            </w:pPr>
+          </w:p>
+          <w:p>
+            <w:pPr>
+              <w:rPr>
+                <w:rFonts w:ascii="Garamond" w:hAnsi="Garamond"/>
+                <w:sz w:val="20"/>
+                <w:szCs w:val="20"/>
+              </w:rPr>
+            </w:pPr>
+          </w:p>
+          <w:p>
+            <w:pPr>
+              <w:rPr>
+                <w:rFonts w:ascii="Garamond" w:hAnsi="Garamond"/>
+                <w:sz w:val="20"/>
+                <w:szCs w:val="20"/>
+              </w:rPr>
+            </w:pPr>
+          </w:p>
+          <w:p>
+            <w:pPr>
+              <w:rPr>
+                <w:rFonts w:ascii="Garamond" w:hAnsi="Garamond"/>
+                <w:sz w:val="20"/>
+                <w:szCs w:val="20"/>
+              </w:rPr>
+            </w:pPr>
+          </w:p>
+          <w:p>
+            <w:pPr>
+              <w:rPr>
+                <w:rFonts w:ascii="Garamond" w:hAnsi="Garamond"/>
+                <w:sz w:val="20"/>
+                <w:szCs w:val="20"/>
+              </w:rPr>
+            </w:pPr>
+          </w:p>
+          <w:p>
+            <w:pPr>
+              <w:rPr>
+                <w:rFonts w:ascii="Garamond" w:hAnsi="Garamond"/>
+                <w:sz w:val="20"/>
+                <w:szCs w:val="20"/>
+              </w:rPr>
+            </w:pPr>
+          </w:p>
+          <w:p>
+            <w:pPr>
+              <w:rPr>
+                <w:rFonts w:ascii="Garamond" w:hAnsi="Garamond"/>
+                <w:sz w:val="20"/>
+                <w:szCs w:val="20"/>
+              </w:rPr>
+            </w:pPr>
+            <w:r>
+              <w:rPr>
+                <w:rFonts w:ascii="Garamond" w:hAnsi="Garamond"/>
+                <w:sz w:val="20"/>
+                <w:szCs w:val="20"/>
+              </w:rPr>
+              <w:t>30</w:t>
             </w:r>
             <w:r>
               <w:rPr>
@@ -927,41 +969,138 @@
                 <w:sz w:val="20"/>
                 <w:szCs w:val="20"/>
               </w:rPr>
-              <w:t>- Slides (if applicable) are visually interesting and flow well</w:t>
-            </w:r>
-          </w:p>
-          <w:p>
-            <w:pPr>
-              <w:rPr>
-                <w:rFonts w:ascii="Garamond" w:hAnsi="Garamond"/>
-                <w:sz w:val="20"/>
-                <w:szCs w:val="20"/>
-              </w:rPr>
-            </w:pPr>
-            <w:r>
-              <w:rPr>
-                <w:rFonts w:ascii="Garamond" w:hAnsi="Garamond"/>
-                <w:sz w:val="20"/>
-                <w:szCs w:val="20"/>
-              </w:rPr>
-              <w:t>- Worksheets/homework (if applicable) include instructions and are self-obvious</w:t>
-            </w:r>
-          </w:p>
-          <w:p>
-            <w:pPr>
-              <w:rPr>
-                <w:rFonts w:ascii="Garamond" w:hAnsi="Garamond"/>
-                <w:sz w:val="20"/>
-                <w:szCs w:val="20"/>
-              </w:rPr>
-            </w:pPr>
-            <w:r>
-              <w:rPr>
-                <w:rFonts w:ascii="Garamond" w:hAnsi="Garamond"/>
-                <w:sz w:val="20"/>
-                <w:szCs w:val="20"/>
-              </w:rPr>
-              <w:t xml:space="preserve">- Worksheets/homework (if applicable) </w:t>
+              <w:t>- Slides are visually interesting and flow well</w:t>
+            </w:r>
+          </w:p>
+          <w:p>
+            <w:pPr>
+              <w:rPr>
+                <w:rFonts w:ascii="Garamond" w:hAnsi="Garamond"/>
+                <w:sz w:val="20"/>
+                <w:szCs w:val="20"/>
+              </w:rPr>
+            </w:pPr>
+            <w:r>
+              <w:rPr>
+                <w:rFonts w:ascii="Garamond" w:hAnsi="Garamond"/>
+                <w:sz w:val="20"/>
+                <w:szCs w:val="20"/>
+              </w:rPr>
+              <w:t xml:space="preserve">- </w:t>
+            </w:r>
+            <w:r>
+              <w:rPr>
+                <w:rFonts w:ascii="Garamond" w:hAnsi="Garamond"/>
+                <w:sz w:val="20"/>
+                <w:szCs w:val="20"/>
+              </w:rPr>
+              <w:t>PRIMM w</w:t>
+            </w:r>
+            <w:r>
+              <w:rPr>
+                <w:rFonts w:ascii="Garamond" w:hAnsi="Garamond"/>
+                <w:sz w:val="20"/>
+                <w:szCs w:val="20"/>
+              </w:rPr>
+              <w:t>orksheet</w:t>
+            </w:r>
+            <w:r>
+              <w:rPr>
+                <w:rFonts w:ascii="Garamond" w:hAnsi="Garamond"/>
+                <w:sz w:val="20"/>
+                <w:szCs w:val="20"/>
+              </w:rPr>
+              <w:t>(</w:t>
+            </w:r>
+            <w:r>
+              <w:rPr>
+                <w:rFonts w:ascii="Garamond" w:hAnsi="Garamond"/>
+                <w:sz w:val="20"/>
+                <w:szCs w:val="20"/>
+              </w:rPr>
+              <w:t>s</w:t>
+            </w:r>
+            <w:r>
+              <w:rPr>
+                <w:rFonts w:ascii="Garamond" w:hAnsi="Garamond"/>
+                <w:sz w:val="20"/>
+                <w:szCs w:val="20"/>
+              </w:rPr>
+              <w:t xml:space="preserve">) </w:t>
+            </w:r>
+            <w:r>
+              <w:rPr>
+                <w:rFonts w:ascii="Garamond" w:hAnsi="Garamond"/>
+                <w:sz w:val="20"/>
+                <w:szCs w:val="20"/>
+              </w:rPr>
+              <w:t>include instructions and are self-obvious</w:t>
+            </w:r>
+          </w:p>
+          <w:p>
+            <w:pPr>
+              <w:rPr>
+                <w:rFonts w:ascii="Garamond" w:hAnsi="Garamond"/>
+                <w:sz w:val="20"/>
+                <w:szCs w:val="20"/>
+              </w:rPr>
+            </w:pPr>
+            <w:r>
+              <w:rPr>
+                <w:rFonts w:ascii="Garamond" w:hAnsi="Garamond"/>
+                <w:sz w:val="20"/>
+                <w:szCs w:val="20"/>
+              </w:rPr>
+              <w:t>- PRIMM worksheet(s) progress through the various stages</w:t>
+            </w:r>
+          </w:p>
+          <w:p>
+            <w:pPr>
+              <w:rPr>
+                <w:rFonts w:ascii="Garamond" w:hAnsi="Garamond"/>
+                <w:sz w:val="20"/>
+                <w:szCs w:val="20"/>
+              </w:rPr>
+            </w:pPr>
+            <w:r>
+              <w:rPr>
+                <w:rFonts w:ascii="Garamond" w:hAnsi="Garamond"/>
+                <w:sz w:val="20"/>
+                <w:szCs w:val="20"/>
+              </w:rPr>
+              <w:t xml:space="preserve">- </w:t>
+            </w:r>
+            <w:r>
+              <w:rPr>
+                <w:rFonts w:ascii="Garamond" w:hAnsi="Garamond"/>
+                <w:sz w:val="20"/>
+                <w:szCs w:val="20"/>
+              </w:rPr>
+              <w:t>PRIMM w</w:t>
+            </w:r>
+            <w:r>
+              <w:rPr>
+                <w:rFonts w:ascii="Garamond" w:hAnsi="Garamond"/>
+                <w:sz w:val="20"/>
+                <w:szCs w:val="20"/>
+              </w:rPr>
+              <w:t>orksheet</w:t>
+            </w:r>
+            <w:r>
+              <w:rPr>
+                <w:rFonts w:ascii="Garamond" w:hAnsi="Garamond"/>
+                <w:sz w:val="20"/>
+                <w:szCs w:val="20"/>
+              </w:rPr>
+              <w:t>(s)</w:t>
+            </w:r>
+            <w:r>
+              <w:rPr>
+                <w:rFonts w:ascii="Garamond" w:hAnsi="Garamond"/>
+                <w:sz w:val="20"/>
+                <w:szCs w:val="20"/>
+              </w:rPr>
+              <w:t xml:space="preserve"> </w:t>
             </w:r>
             <w:r>
               <w:rPr>
@@ -1018,6 +1157,39 @@
                 <w:sz w:val="20"/>
                 <w:szCs w:val="20"/>
               </w:rPr>
+              <w:t>- Slides and PRIMM worksheet(s) are related and build on each</w:t>
+            </w:r>
+            <w:r>
+              <w:rPr>
+                <w:rFonts w:ascii="Garamond" w:hAnsi="Garamond"/>
+                <w:sz w:val="20"/>
+                <w:szCs w:val="20"/>
+              </w:rPr>
+              <w:t xml:space="preserve"> </w:t>
+            </w:r>
+            <w:r>
+              <w:rPr>
+                <w:rFonts w:ascii="Garamond" w:hAnsi="Garamond"/>
+                <w:sz w:val="20"/>
+                <w:szCs w:val="20"/>
+              </w:rPr>
+              <w:t xml:space="preserve">other </w:t>
+            </w:r>
+          </w:p>
+          <w:p>
+            <w:pPr>
+              <w:rPr>
+                <w:rFonts w:ascii="Garamond" w:hAnsi="Garamond"/>
+                <w:sz w:val="20"/>
+                <w:szCs w:val="20"/>
+              </w:rPr>
+            </w:pPr>
+            <w:r>
+              <w:rPr>
+                <w:rFonts w:ascii="Garamond" w:hAnsi="Garamond"/>
+                <w:sz w:val="20"/>
+                <w:szCs w:val="20"/>
+              </w:rPr>
               <w:t xml:space="preserve">- </w:t>
             </w:r>
             <w:r>
@@ -1026,15 +1198,23 @@
                 <w:sz w:val="20"/>
                 <w:szCs w:val="20"/>
               </w:rPr>
-              <w:t>Assessments</w:t>
-            </w:r>
-            <w:r>
-              <w:rPr>
-                <w:rFonts w:ascii="Garamond" w:hAnsi="Garamond"/>
-                <w:sz w:val="20"/>
-                <w:szCs w:val="20"/>
-              </w:rPr>
-              <w:t xml:space="preserve"> (if applicable) are clear, achievable, and </w:t>
+              <w:t>Assessment</w:t>
+            </w:r>
+            <w:r>
+              <w:rPr>
+                <w:rFonts w:ascii="Garamond" w:hAnsi="Garamond"/>
+                <w:sz w:val="20"/>
+                <w:szCs w:val="20"/>
+              </w:rPr>
+              <w:t xml:space="preserve">(s) </w:t>
+            </w:r>
+            <w:r>
+              <w:rPr>
+                <w:rFonts w:ascii="Garamond" w:hAnsi="Garamond"/>
+                <w:sz w:val="20"/>
+                <w:szCs w:val="20"/>
+              </w:rPr>
+              <w:t xml:space="preserve">are clear, achievable, and </w:t>
             </w:r>
             <w:r>
               <w:rPr>
@@ -1309,8 +1489,34 @@
                 <w:sz w:val="20"/>
                 <w:szCs w:val="20"/>
               </w:rPr>
-              <w:t>Lessons identify and utilize best-practice techniques throughout lesson</w:t>
-            </w:r>
+              <w:t>Human learning terms utilized and identified with clear rationale</w:t>
+            </w:r>
+            <w:r>
+              <w:rPr>
+                <w:rFonts w:ascii="Garamond" w:hAnsi="Garamond"/>
+                <w:sz w:val="20"/>
+                <w:szCs w:val="20"/>
+              </w:rPr>
+              <w:t xml:space="preserve"> </w:t>
+            </w:r>
+          </w:p>
+          <w:p>
+            <w:pPr>
+              <w:rPr>
+                <w:rFonts w:ascii="Garamond" w:hAnsi="Garamond"/>
+                <w:sz w:val="20"/>
+                <w:szCs w:val="20"/>
+              </w:rPr>
+            </w:pPr>
+          </w:p>
+          <w:p>
+            <w:pPr>
+              <w:rPr>
+                <w:rFonts w:ascii="Garamond" w:hAnsi="Garamond"/>
+                <w:sz w:val="20"/>
+                <w:szCs w:val="20"/>
+              </w:rPr>
+            </w:pPr>
           </w:p>
           <w:p>
             <w:pPr>
@@ -1366,74 +1572,121 @@
                 <w:sz w:val="20"/>
                 <w:szCs w:val="20"/>
               </w:rPr>
-              <w:t>- Lessons utilize at least 5 different “best practice” techniques</w:t>
-            </w:r>
-          </w:p>
-          <w:p>
-            <w:pPr>
-              <w:rPr>
-                <w:rFonts w:ascii="Garamond" w:hAnsi="Garamond"/>
-                <w:sz w:val="20"/>
-                <w:szCs w:val="20"/>
-              </w:rPr>
-            </w:pPr>
-            <w:r>
-              <w:rPr>
-                <w:rFonts w:ascii="Garamond" w:hAnsi="Garamond"/>
-                <w:sz w:val="20"/>
-                <w:szCs w:val="20"/>
-              </w:rPr>
-              <w:t xml:space="preserve">- “Best practice” techniques are identified </w:t>
-            </w:r>
-            <w:r>
-              <w:rPr>
-                <w:rFonts w:ascii="Garamond" w:hAnsi="Garamond"/>
-                <w:sz w:val="20"/>
-                <w:szCs w:val="20"/>
-              </w:rPr>
-              <w:t xml:space="preserve">in parentheticals and highlighted in </w:t>
-            </w:r>
-            <w:r>
-              <w:rPr>
-                <w:rFonts w:ascii="Garamond" w:hAnsi="Garamond"/>
-                <w:sz w:val="20"/>
-                <w:szCs w:val="20"/>
-                <w:highlight w:val="green"/>
-              </w:rPr>
-              <w:t>green</w:t>
-            </w:r>
-            <w:r>
-              <w:rPr>
-                <w:rFonts w:ascii="Garamond" w:hAnsi="Garamond"/>
-                <w:sz w:val="20"/>
-                <w:szCs w:val="20"/>
-              </w:rPr>
-              <w:t xml:space="preserve"> wherever</w:t>
-            </w:r>
-            <w:r>
-              <w:rPr>
-                <w:rFonts w:ascii="Garamond" w:hAnsi="Garamond"/>
-                <w:sz w:val="20"/>
-                <w:szCs w:val="20"/>
-              </w:rPr>
-              <w:t xml:space="preserve"> they occur in lesson plan</w:t>
-            </w:r>
-          </w:p>
-          <w:p>
-            <w:pPr>
-              <w:rPr>
-                <w:rFonts w:ascii="Garamond" w:hAnsi="Garamond"/>
-                <w:sz w:val="20"/>
-                <w:szCs w:val="20"/>
-              </w:rPr>
-            </w:pPr>
-            <w:r>
-              <w:rPr>
-                <w:rFonts w:ascii="Garamond" w:hAnsi="Garamond"/>
-                <w:sz w:val="20"/>
-                <w:szCs w:val="20"/>
-              </w:rPr>
-              <w:t>- All opportunities to apply “best practice” are taken</w:t>
+              <w:t>- Lessons utilize at least 5 different “</w:t>
+            </w:r>
+            <w:r>
+              <w:rPr>
+                <w:rFonts w:ascii="Garamond" w:hAnsi="Garamond"/>
+                <w:sz w:val="20"/>
+                <w:szCs w:val="20"/>
+              </w:rPr>
+              <w:t>human learning</w:t>
+            </w:r>
+            <w:r>
+              <w:rPr>
+                <w:rFonts w:ascii="Garamond" w:hAnsi="Garamond"/>
+                <w:sz w:val="20"/>
+                <w:szCs w:val="20"/>
+              </w:rPr>
+              <w:t>” techniques</w:t>
+            </w:r>
+          </w:p>
+          <w:p>
+            <w:pPr>
+              <w:rPr>
+                <w:rFonts w:ascii="Garamond" w:hAnsi="Garamond"/>
+                <w:sz w:val="20"/>
+                <w:szCs w:val="20"/>
+              </w:rPr>
+            </w:pPr>
+            <w:r>
+              <w:rPr>
+                <w:rFonts w:ascii="Garamond" w:hAnsi="Garamond"/>
+                <w:sz w:val="20"/>
+                <w:szCs w:val="20"/>
+              </w:rPr>
+              <w:t>- “</w:t>
+            </w:r>
+            <w:r>
+              <w:rPr>
+                <w:rFonts w:ascii="Garamond" w:hAnsi="Garamond"/>
+                <w:sz w:val="20"/>
+                <w:szCs w:val="20"/>
+              </w:rPr>
+              <w:t>Human learning</w:t>
+            </w:r>
+            <w:r>
+              <w:rPr>
+                <w:rFonts w:ascii="Garamond" w:hAnsi="Garamond"/>
+                <w:sz w:val="20"/>
+                <w:szCs w:val="20"/>
+              </w:rPr>
+              <w:t xml:space="preserve">” techniques are identified </w:t>
+            </w:r>
+            <w:r>
+              <w:rPr>
+                <w:rFonts w:ascii="Garamond" w:hAnsi="Garamond"/>
+                <w:sz w:val="20"/>
+                <w:szCs w:val="20"/>
+              </w:rPr>
+              <w:t xml:space="preserve">via comments </w:t>
+            </w:r>
+            <w:r>
+              <w:rPr>
+                <w:rFonts w:ascii="Garamond" w:hAnsi="Garamond"/>
+                <w:sz w:val="20"/>
+                <w:szCs w:val="20"/>
+              </w:rPr>
+              <w:t>wherever</w:t>
+            </w:r>
+            <w:r>
+              <w:rPr>
+                <w:rFonts w:ascii="Garamond" w:hAnsi="Garamond"/>
+                <w:sz w:val="20"/>
+                <w:szCs w:val="20"/>
+              </w:rPr>
+              <w:t xml:space="preserve"> they occur in </w:t>
+            </w:r>
+            <w:r>
+              <w:rPr>
+                <w:rFonts w:ascii="Garamond" w:hAnsi="Garamond"/>
+                <w:sz w:val="20"/>
+                <w:szCs w:val="20"/>
+              </w:rPr>
+              <w:t xml:space="preserve">the </w:t>
+            </w:r>
+            <w:r>
+              <w:rPr>
+                <w:rFonts w:ascii="Garamond" w:hAnsi="Garamond"/>
+                <w:sz w:val="20"/>
+                <w:szCs w:val="20"/>
+              </w:rPr>
+              <w:t>lesson plan</w:t>
+            </w:r>
+          </w:p>
+          <w:p>
+            <w:pPr>
+              <w:rPr>
+                <w:rFonts w:ascii="Garamond" w:hAnsi="Garamond"/>
+                <w:sz w:val="20"/>
+                <w:szCs w:val="20"/>
+              </w:rPr>
+            </w:pPr>
+            <w:r>
+              <w:rPr>
+                <w:rFonts w:ascii="Garamond" w:hAnsi="Garamond"/>
+                <w:sz w:val="20"/>
+                <w:szCs w:val="20"/>
+              </w:rPr>
+              <w:t xml:space="preserve">- </w:t>
+            </w:r>
+            <w:r>
+              <w:rPr>
+                <w:rFonts w:ascii="Garamond" w:hAnsi="Garamond"/>
+                <w:sz w:val="20"/>
+                <w:szCs w:val="20"/>
+              </w:rPr>
+              <w:t>Each comment includes 1-2 sentences explaining of how the technique promotes learning</w:t>
             </w:r>
           </w:p>
         </w:tc>
@@ -1660,7 +1913,23 @@
                 <w:sz w:val="20"/>
                 <w:szCs w:val="20"/>
               </w:rPr>
-              <w:t xml:space="preserve">- Vocabulary from ML lessons </w:t>
+              <w:t xml:space="preserve">- </w:t>
+            </w:r>
+            <w:r>
+              <w:rPr>
+                <w:rFonts w:ascii="Garamond" w:hAnsi="Garamond"/>
+                <w:sz w:val="20"/>
+                <w:szCs w:val="20"/>
+              </w:rPr>
+              <w:t>ML analogs</w:t>
+            </w:r>
+            <w:r>
+              <w:rPr>
+                <w:rFonts w:ascii="Garamond" w:hAnsi="Garamond"/>
+                <w:sz w:val="20"/>
+                <w:szCs w:val="20"/>
+              </w:rPr>
+              <w:t xml:space="preserve"> </w:t>
             </w:r>
             <w:r>
               <w:rPr>
@@ -1692,32 +1961,72 @@
                 <w:sz w:val="20"/>
                 <w:szCs w:val="20"/>
               </w:rPr>
-              <w:t xml:space="preserve"> parentheticals</w:t>
-            </w:r>
-            <w:r>
-              <w:rPr>
-                <w:rFonts w:ascii="Garamond" w:hAnsi="Garamond"/>
-                <w:sz w:val="20"/>
-                <w:szCs w:val="20"/>
-              </w:rPr>
-              <w:t xml:space="preserve"> and highlighted in </w:t>
-            </w:r>
-            <w:r>
-              <w:rPr>
-                <w:rFonts w:ascii="Garamond" w:hAnsi="Garamond"/>
-                <w:sz w:val="20"/>
-                <w:szCs w:val="20"/>
-                <w:highlight w:val="red"/>
-              </w:rPr>
-              <w:t>red</w:t>
-            </w:r>
-            <w:r>
-              <w:rPr>
-                <w:rFonts w:ascii="Garamond" w:hAnsi="Garamond"/>
-                <w:sz w:val="20"/>
-                <w:szCs w:val="20"/>
-              </w:rPr>
-              <w:t xml:space="preserve"> wherever appropriate in lesson plan</w:t>
+              <w:t xml:space="preserve"> </w:t>
+            </w:r>
+            <w:r>
+              <w:rPr>
+                <w:rFonts w:ascii="Garamond" w:hAnsi="Garamond"/>
+                <w:sz w:val="20"/>
+                <w:szCs w:val="20"/>
+              </w:rPr>
+              <w:t xml:space="preserve">via comments wherever they occur in the </w:t>
+            </w:r>
+            <w:r>
+              <w:rPr>
+                <w:rFonts w:ascii="Garamond" w:hAnsi="Garamond"/>
+                <w:sz w:val="20"/>
+                <w:szCs w:val="20"/>
+              </w:rPr>
+              <w:t>lesson plan</w:t>
+            </w:r>
+          </w:p>
+          <w:p>
+            <w:pPr>
+              <w:rPr>
+                <w:rFonts w:ascii="Garamond" w:hAnsi="Garamond"/>
+                <w:sz w:val="20"/>
+                <w:szCs w:val="20"/>
+              </w:rPr>
+            </w:pPr>
+            <w:r>
+              <w:rPr>
+                <w:rFonts w:ascii="Garamond" w:hAnsi="Garamond"/>
+                <w:sz w:val="20"/>
+                <w:szCs w:val="20"/>
+              </w:rPr>
+              <w:t>- Each comment includes 1</w:t>
+            </w:r>
+            <w:r>
+              <w:rPr>
+                <w:rFonts w:ascii="Garamond" w:hAnsi="Garamond"/>
+                <w:sz w:val="20"/>
+                <w:szCs w:val="20"/>
+              </w:rPr>
+              <w:t>-2 sentences</w:t>
+            </w:r>
+            <w:r>
+              <w:rPr>
+                <w:rFonts w:ascii="Garamond" w:hAnsi="Garamond"/>
+                <w:sz w:val="20"/>
+                <w:szCs w:val="20"/>
+              </w:rPr>
+              <w:t xml:space="preserve"> </w:t>
+            </w:r>
+            <w:r>
+              <w:rPr>
+                <w:rFonts w:ascii="Garamond" w:hAnsi="Garamond"/>
+                <w:sz w:val="20"/>
+                <w:szCs w:val="20"/>
+              </w:rPr>
+              <w:t xml:space="preserve">explaining </w:t>
+            </w:r>
+            <w:r>
+              <w:rPr>
+                <w:rFonts w:ascii="Garamond" w:hAnsi="Garamond"/>
+                <w:sz w:val="20"/>
+                <w:szCs w:val="20"/>
+              </w:rPr>
+              <w:t>ML connection and demonstrates understanding of domain</w:t>
             </w:r>
           </w:p>
         </w:tc>

</xml_diff>

<commit_message>
Fix typos and formatting of teachign unit rubric
</commit_message>
<xml_diff>
--- a/CourseMaterial/04_learning_machines/08_teaching_unit/teaching_unit_rubric.docx
+++ b/CourseMaterial/04_learning_machines/08_teaching_unit/teaching_unit_rubric.docx
@@ -17,8 +17,8 @@
       </w:tblPr>
       <w:tblGrid>
         <w:gridCol w:w="2220"/>
-        <w:gridCol w:w="3764"/>
-        <w:gridCol w:w="1432"/>
+        <w:gridCol w:w="3895"/>
+        <w:gridCol w:w="1301"/>
         <w:gridCol w:w="1344"/>
         <w:gridCol w:w="1315"/>
       </w:tblGrid>
@@ -76,7 +76,7 @@
         </w:tc>
         <w:tc>
           <w:tcPr>
-            <w:tcW w:w="3764" w:type="dxa"/>
+            <w:tcW w:w="3895" w:type="dxa"/>
           </w:tcPr>
           <w:p>
             <w:pPr>
@@ -98,7 +98,7 @@
         </w:tc>
         <w:tc>
           <w:tcPr>
-            <w:tcW w:w="1432" w:type="dxa"/>
+            <w:tcW w:w="1301" w:type="dxa"/>
           </w:tcPr>
           <w:p>
             <w:pPr>
@@ -201,17 +201,24 @@
                 <w:sz w:val="20"/>
                 <w:szCs w:val="20"/>
               </w:rPr>
-              <w:t>uestions and objectives are thoughtful, realistic, and scaled</w:t>
-            </w:r>
-          </w:p>
-          <w:p>
-            <w:pPr>
-              <w:rPr>
-                <w:rFonts w:ascii="Garamond" w:hAnsi="Garamond"/>
-                <w:sz w:val="20"/>
-                <w:szCs w:val="20"/>
-              </w:rPr>
-            </w:pPr>
+              <w:t>uestions and</w:t>
+            </w:r>
+            <w:r>
+              <w:rPr>
+                <w:rFonts w:ascii="Garamond" w:hAnsi="Garamond"/>
+                <w:sz w:val="20"/>
+                <w:szCs w:val="20"/>
+              </w:rPr>
+              <w:t xml:space="preserve"> Learning Objectives</w:t>
+            </w:r>
+            <w:r>
+              <w:rPr>
+                <w:rFonts w:ascii="Garamond" w:hAnsi="Garamond"/>
+                <w:sz w:val="20"/>
+                <w:szCs w:val="20"/>
+              </w:rPr>
+              <w:t xml:space="preserve"> are thoughtful, realistic, and scaled</w:t>
+            </w:r>
           </w:p>
           <w:p>
             <w:pPr>
@@ -258,7 +265,7 @@
         </w:tc>
         <w:tc>
           <w:tcPr>
-            <w:tcW w:w="3764" w:type="dxa"/>
+            <w:tcW w:w="3895" w:type="dxa"/>
           </w:tcPr>
           <w:p>
             <w:pPr>
@@ -331,7 +338,7 @@
         </w:tc>
         <w:tc>
           <w:tcPr>
-            <w:tcW w:w="1432" w:type="dxa"/>
+            <w:tcW w:w="1301" w:type="dxa"/>
           </w:tcPr>
           <w:p>
             <w:pPr>
@@ -474,7 +481,7 @@
         </w:tc>
         <w:tc>
           <w:tcPr>
-            <w:tcW w:w="3764" w:type="dxa"/>
+            <w:tcW w:w="3895" w:type="dxa"/>
           </w:tcPr>
           <w:p>
             <w:pPr>
@@ -547,7 +554,7 @@
         </w:tc>
         <w:tc>
           <w:tcPr>
-            <w:tcW w:w="1432" w:type="dxa"/>
+            <w:tcW w:w="1301" w:type="dxa"/>
           </w:tcPr>
           <w:p>
             <w:pPr>
@@ -692,7 +699,7 @@
         </w:tc>
         <w:tc>
           <w:tcPr>
-            <w:tcW w:w="3764" w:type="dxa"/>
+            <w:tcW w:w="3895" w:type="dxa"/>
           </w:tcPr>
           <w:p>
             <w:pPr>
@@ -756,7 +763,7 @@
         </w:tc>
         <w:tc>
           <w:tcPr>
-            <w:tcW w:w="1432" w:type="dxa"/>
+            <w:tcW w:w="1301" w:type="dxa"/>
           </w:tcPr>
           <w:p>
             <w:pPr>
@@ -953,7 +960,7 @@
         </w:tc>
         <w:tc>
           <w:tcPr>
-            <w:tcW w:w="3764" w:type="dxa"/>
+            <w:tcW w:w="3895" w:type="dxa"/>
           </w:tcPr>
           <w:p>
             <w:pPr>
@@ -1228,7 +1235,7 @@
         </w:tc>
         <w:tc>
           <w:tcPr>
-            <w:tcW w:w="1432" w:type="dxa"/>
+            <w:tcW w:w="1301" w:type="dxa"/>
           </w:tcPr>
           <w:p>
             <w:pPr>
@@ -1363,7 +1370,7 @@
         </w:tc>
         <w:tc>
           <w:tcPr>
-            <w:tcW w:w="3764" w:type="dxa"/>
+            <w:tcW w:w="3895" w:type="dxa"/>
           </w:tcPr>
           <w:p>
             <w:pPr>
@@ -1402,7 +1409,7 @@
         </w:tc>
         <w:tc>
           <w:tcPr>
-            <w:tcW w:w="1432" w:type="dxa"/>
+            <w:tcW w:w="1301" w:type="dxa"/>
           </w:tcPr>
           <w:p>
             <w:pPr>
@@ -1556,7 +1563,7 @@
         </w:tc>
         <w:tc>
           <w:tcPr>
-            <w:tcW w:w="3764" w:type="dxa"/>
+            <w:tcW w:w="3895" w:type="dxa"/>
           </w:tcPr>
           <w:p>
             <w:pPr>
@@ -1692,7 +1699,7 @@
         </w:tc>
         <w:tc>
           <w:tcPr>
-            <w:tcW w:w="1432" w:type="dxa"/>
+            <w:tcW w:w="1301" w:type="dxa"/>
           </w:tcPr>
           <w:p>
             <w:pPr>
@@ -1857,7 +1864,23 @@
                 <w:sz w:val="20"/>
                 <w:szCs w:val="20"/>
               </w:rPr>
-              <w:t>Analogs to ML are identified throughout the lesson</w:t>
+              <w:t>Analog</w:t>
+            </w:r>
+            <w:r>
+              <w:rPr>
+                <w:rFonts w:ascii="Garamond" w:hAnsi="Garamond"/>
+                <w:sz w:val="20"/>
+                <w:szCs w:val="20"/>
+              </w:rPr>
+              <w:t>ies</w:t>
+            </w:r>
+            <w:r>
+              <w:rPr>
+                <w:rFonts w:ascii="Garamond" w:hAnsi="Garamond"/>
+                <w:sz w:val="20"/>
+                <w:szCs w:val="20"/>
+              </w:rPr>
+              <w:t xml:space="preserve"> to ML are identified throughout the lesson</w:t>
             </w:r>
           </w:p>
           <w:p>
@@ -1897,7 +1920,7 @@
         </w:tc>
         <w:tc>
           <w:tcPr>
-            <w:tcW w:w="3764" w:type="dxa"/>
+            <w:tcW w:w="3895" w:type="dxa"/>
           </w:tcPr>
           <w:p>
             <w:pPr>
@@ -2032,7 +2055,7 @@
         </w:tc>
         <w:tc>
           <w:tcPr>
-            <w:tcW w:w="1432" w:type="dxa"/>
+            <w:tcW w:w="1301" w:type="dxa"/>
           </w:tcPr>
           <w:p>
             <w:pPr>

</xml_diff>